<commit_message>
Shorten the SAD: merge small tables and drop extra sections
Keep every section of the SAD template. Group the traceability table by
feature, merge the API and error tables, and remove the stakeholder,
ADR and risk rows that only repeated other content.
</commit_message>
<xml_diff>
--- a/docs/Test_Plan.docx
+++ b/docs/Test_Plan.docx
@@ -114,7 +114,7 @@
         <w:t>Scope.</w:t>
       </w:r>
       <w:r>
-        <w:t xml:space="preserve"> All functional requirements REQ-1 to REQ-22 and all non-functional requirements NFR-1 to NFR-5, including the security requirements SEC-1 to SEC-6 of SRS v1.2. Testing is done on the compiled program and on single C modules.</w:t>
+        <w:t xml:space="preserve"> All functional requirements REQ-1 to REQ-22 and all non-functional requirements NFR-1 to NFR-5, including the security requirements SEC-1 to SEC-6 of SRS v1.1. Testing is done on the compiled program and on single C modules.</w:t>
       </w:r>
     </w:p>
     <w:p>
@@ -130,7 +130,7 @@
         <w:pStyle w:val="ListBullet"/>
       </w:pPr>
       <w:r>
-        <w:t>Online Quiz System SRS v1.2 (</w:t>
+        <w:t>Online Quiz System SRS v1.1 (</w:t>
       </w:r>
       <w:r>
         <w:rPr>
@@ -147,7 +147,7 @@
         <w:pStyle w:val="ListBullet"/>
       </w:pPr>
       <w:r>
-        <w:t>Software Architecture and Design Specification v1.1 (</w:t>
+        <w:t>Software Architecture and Design Specification v1.0 (</w:t>
       </w:r>
       <w:r>
         <w:rPr>
@@ -7967,7 +7967,7 @@
     <w:p/>
     <w:p>
       <w:r>
-        <w:t>Every requirement in SRS v1.2 appears in at least one test case.</w:t>
+        <w:t>Every requirement in SRS v1.1 appears in at least one test case.</w:t>
       </w:r>
     </w:p>
     <w:p>

</xml_diff>